<commit_message>
Repair npj supplement S8 pagination
</commit_message>
<xml_diff>
--- a/phase17_v7/npj_sba_final_hardening/20260830_final_render_semantic_hardening/documents/Supplementary_Information.docx
+++ b/phase17_v7/npj_sba_final_hardening/20260830_final_render_semantic_hardening/documents/Supplementary_Information.docx
@@ -7864,7 +7864,7 @@
       <w:r>
         <w:drawing>
           <wp:inline xmlns:a="http://schemas.openxmlformats.org/drawingml/2006/main" xmlns:pic="http://schemas.openxmlformats.org/drawingml/2006/picture">
-            <wp:extent cx="5806440" cy="7343737"/>
+            <wp:extent cx="5806440" cy="5294490"/>
             <wp:docPr id="8" name="Picture 8" title="Supplementary Figure S8" descr="Supplementary Figure S8; full panel description appears immediately above the figure."/>
             <wp:cNvGraphicFramePr>
               <a:graphicFrameLocks noChangeAspect="1"/>
@@ -7885,7 +7885,7 @@
                   <pic:spPr>
                     <a:xfrm>
                       <a:off x="0" y="0"/>
-                      <a:ext cx="5806440" cy="7343737"/>
+                      <a:ext cx="5806440" cy="5294490"/>
                     </a:xfrm>
                     <a:prstGeom prst="rect"/>
                   </pic:spPr>

</xml_diff>